<commit_message>
fix(classification): separate source evidence from system conclusion
</commit_message>
<xml_diff>
--- a/tests/golden/stage83/variant_001_report.docx
+++ b/tests/golden/stage83/variant_001_report.docx
@@ -314,7 +314,7 @@
               <w:pStyle w:val="ResultClassification"/>
             </w:pPr>
             <w:r>
-              <w:t>Uncertain significance</w:t>
+              <w:t>Not independently determined</w:t>
             </w:r>
           </w:p>
           <w:p>
@@ -322,7 +322,7 @@
               <w:pStyle w:val="ResultSource"/>
             </w:pPr>
             <w:r>
-              <w:t>Source: NCBI ClinVar</w:t>
+              <w:t>Source: No independent application classification</w:t>
             </w:r>
           </w:p>
         </w:tc>
@@ -1363,7 +1363,7 @@
                 <w:sz w:val="19"/>
                 <w:u w:val="none"/>
               </w:rPr>
-              <w:t>NCBI ClinVar: Uncertain significance (criteria provided, single submitter)</w:t>
+              <w:t>NCBI ClinVar: Uncertain significance (VUS) (criteria provided, single submitter)</w:t>
               <w:br/>
               <w:t>GeneBe: Automated uncertain significance (automated annotation only)</w:t>
             </w:r>
@@ -1463,7 +1463,7 @@
         <w:pStyle w:val="ReportBody"/>
       </w:pPr>
       <w:r>
-        <w:t>The retained sources provide uncertain-significance context without an independently adjudicated application classification. Reviewer-confirmed classification: Not available. ClinVar classification: Uncertain significance. Automated classification context: GeneBe automated uncertain significance. Conflict status: none. Sources: NCBI ClinVar, GeneBe automated annotation. The application has not independently adjudicated an ACMG/AMP classification.</w:t>
+        <w:t>The retained sources provide uncertain-significance context without an independently adjudicated application classification. Reviewer-confirmed classification: Not available. ClinVar classification: Uncertain significance (VUS). Automated classification context: GeneBe automated uncertain significance. Conflict status: none. Sources: NCBI ClinVar, GeneBe automated annotation. The application has not independently adjudicated an ACMG/AMP classification.</w:t>
       </w:r>
     </w:p>
     <w:p>

</xml_diff>